<commit_message>
docs(ref): WO-REF01-059-B2-L01-PATCH-1 — Landscape 엔진 QA 보완
A. min_row_height_mm: repeat_table JSON 설정 지원 → c014에 10mm 적용, 기본 10행 1페이지 확보
B. 데이터 보존: PDF R00~R29 마커 전 페이지 검증 + DOCX 행수 구조검증 분리
C. 메타데이터: OWNER-HWP-02/source_checksum 원복
D. Orientation fail-closed: Node.js null/빈문자/숫자 → 명시적 오류(|| 제거, 'in' 사용)
Tests: 139/139 PASS (127 기존 + 12 신규).
SHA256: py=0dd50aff cjs=ec3a0fa9 c014=c50a99c5

Co-Authored-By: Claude Sonnet 4.6 <noreply@anthropic.com>
</commit_message>
<xml_diff>
--- a/docs/reference-forms/output/TAI-FORM-C014-30rows.docx
+++ b/docs/reference-forms/output/TAI-FORM-C014-30rows.docx
@@ -438,7 +438,7 @@
       </w:tr>
       <w:tr>
         <w:trPr>
-          <w:trHeight w:val="793" w:hRule="atLeast"/>
+          <w:trHeight w:val="566" w:hRule="atLeast"/>
         </w:trPr>
         <w:tc>
           <w:tcPr>
@@ -763,7 +763,7 @@
       </w:tr>
       <w:tr>
         <w:trPr>
-          <w:trHeight w:val="793" w:hRule="atLeast"/>
+          <w:trHeight w:val="566" w:hRule="atLeast"/>
         </w:trPr>
         <w:tc>
           <w:tcPr>
@@ -1088,7 +1088,7 @@
       </w:tr>
       <w:tr>
         <w:trPr>
-          <w:trHeight w:val="793" w:hRule="atLeast"/>
+          <w:trHeight w:val="566" w:hRule="atLeast"/>
         </w:trPr>
         <w:tc>
           <w:tcPr>
@@ -1413,7 +1413,7 @@
       </w:tr>
       <w:tr>
         <w:trPr>
-          <w:trHeight w:val="793" w:hRule="atLeast"/>
+          <w:trHeight w:val="566" w:hRule="atLeast"/>
         </w:trPr>
         <w:tc>
           <w:tcPr>
@@ -1738,7 +1738,7 @@
       </w:tr>
       <w:tr>
         <w:trPr>
-          <w:trHeight w:val="793" w:hRule="atLeast"/>
+          <w:trHeight w:val="566" w:hRule="atLeast"/>
         </w:trPr>
         <w:tc>
           <w:tcPr>
@@ -2063,7 +2063,7 @@
       </w:tr>
       <w:tr>
         <w:trPr>
-          <w:trHeight w:val="793" w:hRule="atLeast"/>
+          <w:trHeight w:val="566" w:hRule="atLeast"/>
         </w:trPr>
         <w:tc>
           <w:tcPr>
@@ -2388,7 +2388,7 @@
       </w:tr>
       <w:tr>
         <w:trPr>
-          <w:trHeight w:val="793" w:hRule="atLeast"/>
+          <w:trHeight w:val="566" w:hRule="atLeast"/>
         </w:trPr>
         <w:tc>
           <w:tcPr>
@@ -2713,7 +2713,7 @@
       </w:tr>
       <w:tr>
         <w:trPr>
-          <w:trHeight w:val="793" w:hRule="atLeast"/>
+          <w:trHeight w:val="566" w:hRule="atLeast"/>
         </w:trPr>
         <w:tc>
           <w:tcPr>
@@ -3038,7 +3038,7 @@
       </w:tr>
       <w:tr>
         <w:trPr>
-          <w:trHeight w:val="793" w:hRule="atLeast"/>
+          <w:trHeight w:val="566" w:hRule="atLeast"/>
         </w:trPr>
         <w:tc>
           <w:tcPr>
@@ -3363,7 +3363,7 @@
       </w:tr>
       <w:tr>
         <w:trPr>
-          <w:trHeight w:val="793" w:hRule="atLeast"/>
+          <w:trHeight w:val="566" w:hRule="atLeast"/>
         </w:trPr>
         <w:tc>
           <w:tcPr>
@@ -3688,7 +3688,7 @@
       </w:tr>
       <w:tr>
         <w:trPr>
-          <w:trHeight w:val="793" w:hRule="atLeast"/>
+          <w:trHeight w:val="566" w:hRule="atLeast"/>
         </w:trPr>
         <w:tc>
           <w:tcPr>
@@ -4013,7 +4013,7 @@
       </w:tr>
       <w:tr>
         <w:trPr>
-          <w:trHeight w:val="793" w:hRule="atLeast"/>
+          <w:trHeight w:val="566" w:hRule="atLeast"/>
         </w:trPr>
         <w:tc>
           <w:tcPr>
@@ -4338,7 +4338,7 @@
       </w:tr>
       <w:tr>
         <w:trPr>
-          <w:trHeight w:val="793" w:hRule="atLeast"/>
+          <w:trHeight w:val="566" w:hRule="atLeast"/>
         </w:trPr>
         <w:tc>
           <w:tcPr>
@@ -4663,7 +4663,7 @@
       </w:tr>
       <w:tr>
         <w:trPr>
-          <w:trHeight w:val="793" w:hRule="atLeast"/>
+          <w:trHeight w:val="566" w:hRule="atLeast"/>
         </w:trPr>
         <w:tc>
           <w:tcPr>
@@ -4988,7 +4988,7 @@
       </w:tr>
       <w:tr>
         <w:trPr>
-          <w:trHeight w:val="793" w:hRule="atLeast"/>
+          <w:trHeight w:val="566" w:hRule="atLeast"/>
         </w:trPr>
         <w:tc>
           <w:tcPr>
@@ -5313,7 +5313,7 @@
       </w:tr>
       <w:tr>
         <w:trPr>
-          <w:trHeight w:val="793" w:hRule="atLeast"/>
+          <w:trHeight w:val="566" w:hRule="atLeast"/>
         </w:trPr>
         <w:tc>
           <w:tcPr>
@@ -5638,7 +5638,7 @@
       </w:tr>
       <w:tr>
         <w:trPr>
-          <w:trHeight w:val="793" w:hRule="atLeast"/>
+          <w:trHeight w:val="566" w:hRule="atLeast"/>
         </w:trPr>
         <w:tc>
           <w:tcPr>
@@ -5963,7 +5963,7 @@
       </w:tr>
       <w:tr>
         <w:trPr>
-          <w:trHeight w:val="793" w:hRule="atLeast"/>
+          <w:trHeight w:val="566" w:hRule="atLeast"/>
         </w:trPr>
         <w:tc>
           <w:tcPr>
@@ -6288,7 +6288,7 @@
       </w:tr>
       <w:tr>
         <w:trPr>
-          <w:trHeight w:val="793" w:hRule="atLeast"/>
+          <w:trHeight w:val="566" w:hRule="atLeast"/>
         </w:trPr>
         <w:tc>
           <w:tcPr>
@@ -6613,7 +6613,7 @@
       </w:tr>
       <w:tr>
         <w:trPr>
-          <w:trHeight w:val="793" w:hRule="atLeast"/>
+          <w:trHeight w:val="566" w:hRule="atLeast"/>
         </w:trPr>
         <w:tc>
           <w:tcPr>
@@ -6938,7 +6938,7 @@
       </w:tr>
       <w:tr>
         <w:trPr>
-          <w:trHeight w:val="793" w:hRule="atLeast"/>
+          <w:trHeight w:val="566" w:hRule="atLeast"/>
         </w:trPr>
         <w:tc>
           <w:tcPr>
@@ -7263,7 +7263,7 @@
       </w:tr>
       <w:tr>
         <w:trPr>
-          <w:trHeight w:val="793" w:hRule="atLeast"/>
+          <w:trHeight w:val="566" w:hRule="atLeast"/>
         </w:trPr>
         <w:tc>
           <w:tcPr>
@@ -7588,7 +7588,7 @@
       </w:tr>
       <w:tr>
         <w:trPr>
-          <w:trHeight w:val="793" w:hRule="atLeast"/>
+          <w:trHeight w:val="566" w:hRule="atLeast"/>
         </w:trPr>
         <w:tc>
           <w:tcPr>
@@ -7913,7 +7913,7 @@
       </w:tr>
       <w:tr>
         <w:trPr>
-          <w:trHeight w:val="793" w:hRule="atLeast"/>
+          <w:trHeight w:val="566" w:hRule="atLeast"/>
         </w:trPr>
         <w:tc>
           <w:tcPr>
@@ -8238,7 +8238,7 @@
       </w:tr>
       <w:tr>
         <w:trPr>
-          <w:trHeight w:val="793" w:hRule="atLeast"/>
+          <w:trHeight w:val="566" w:hRule="atLeast"/>
         </w:trPr>
         <w:tc>
           <w:tcPr>
@@ -8563,7 +8563,7 @@
       </w:tr>
       <w:tr>
         <w:trPr>
-          <w:trHeight w:val="793" w:hRule="atLeast"/>
+          <w:trHeight w:val="566" w:hRule="atLeast"/>
         </w:trPr>
         <w:tc>
           <w:tcPr>
@@ -8888,7 +8888,7 @@
       </w:tr>
       <w:tr>
         <w:trPr>
-          <w:trHeight w:val="793" w:hRule="atLeast"/>
+          <w:trHeight w:val="566" w:hRule="atLeast"/>
         </w:trPr>
         <w:tc>
           <w:tcPr>
@@ -9213,7 +9213,7 @@
       </w:tr>
       <w:tr>
         <w:trPr>
-          <w:trHeight w:val="793" w:hRule="atLeast"/>
+          <w:trHeight w:val="566" w:hRule="atLeast"/>
         </w:trPr>
         <w:tc>
           <w:tcPr>
@@ -9538,7 +9538,7 @@
       </w:tr>
       <w:tr>
         <w:trPr>
-          <w:trHeight w:val="793" w:hRule="atLeast"/>
+          <w:trHeight w:val="566" w:hRule="atLeast"/>
         </w:trPr>
         <w:tc>
           <w:tcPr>
@@ -9863,7 +9863,7 @@
       </w:tr>
       <w:tr>
         <w:trPr>
-          <w:trHeight w:val="793" w:hRule="atLeast"/>
+          <w:trHeight w:val="566" w:hRule="atLeast"/>
         </w:trPr>
         <w:tc>
           <w:tcPr>

</xml_diff>